<commit_message>
Split phylum jump nav into two balanced rows and fix Merismopedia caption spelling.
Co-authored-by: Cursor <cursoragent@cursor.com>
</commit_message>
<xml_diff>
--- a/data/raw/Merismopedia 2026-07-26.docx
+++ b/data/raw/Merismopedia 2026-07-26.docx
@@ -1428,7 +1428,26 @@
         <w:rPr>
           <w:rFonts w:cstheme="majorBidi"/>
         </w:rPr>
-        <w:t xml:space="preserve">rectangular. The translucent mucilage is dyed with Toluen Blue. </w:t>
+        <w:t>rectangular. The translucent mucilage is dyed with Tolu</w:t>
+      </w:r>
+      <w:r>
+        <w:rPr>
+          <w:rFonts w:cstheme="majorBidi"/>
+          <w:lang w:val="en-US"/>
+        </w:rPr>
+        <w:t>id</w:t>
+      </w:r>
+      <w:r>
+        <w:rPr>
+          <w:rFonts w:cstheme="majorBidi"/>
+        </w:rPr>
+        <w:t>ine</w:t>
+      </w:r>
+      <w:r>
+        <w:rPr>
+          <w:rFonts w:cstheme="majorBidi"/>
+        </w:rPr>
+        <w:t xml:space="preserve"> Blue. </w:t>
       </w:r>
       <w:r>
         <w:rPr>
@@ -1562,13 +1581,7 @@
         <w:rPr>
           <w:rFonts w:cstheme="majorBidi"/>
         </w:rPr>
-        <w:t xml:space="preserve">. </w:t>
-      </w:r>
-      <w:r>
-        <w:rPr>
-          <w:rFonts w:cstheme="majorBidi"/>
-        </w:rPr>
-        <w:t xml:space="preserve">Photo by Alla Alster. </w:t>
+        <w:t xml:space="preserve">. Photo by Alla Alster. </w:t>
       </w:r>
     </w:p>
     <w:p>
@@ -1684,19 +1697,7 @@
         <w:rPr>
           <w:rFonts w:cstheme="majorBidi"/>
         </w:rPr>
-        <w:t>sp.</w:t>
-      </w:r>
-      <w:r>
-        <w:rPr>
-          <w:rFonts w:cstheme="majorBidi"/>
-        </w:rPr>
-        <w:t xml:space="preserve"> 2</w:t>
-      </w:r>
-      <w:r>
-        <w:rPr>
-          <w:rFonts w:cstheme="majorBidi"/>
-        </w:rPr>
-        <w:t xml:space="preserve">. Photo by Alla Alster. </w:t>
+        <w:t xml:space="preserve">sp. 2. Photo by Alla Alster. </w:t>
       </w:r>
     </w:p>
     <w:p>
@@ -2019,7 +2020,7 @@
           <w:noProof/>
         </w:rPr>
         <w:drawing>
-          <wp:inline distT="0" distB="0" distL="0" distR="0" wp14:anchorId="44226199" wp14:editId="6048B561">
+          <wp:inline distT="0" distB="0" distL="0" distR="0" wp14:anchorId="44226199" wp14:editId="4267E0AF">
             <wp:extent cx="5943600" cy="2921635"/>
             <wp:effectExtent l="0" t="0" r="0" b="0"/>
             <wp:docPr id="1014288384" name="Picture 3"/>

</xml_diff>